<commit_message>
Modernize templates and fix rendering issues
- Fix LaTeX warnings (remove ragged2e/sectsty, patch microtype)
- Fix pandoc 3.x --highlight-style deprecation
- Replace %>% with |> everywhere, fix ggplot2 loading
- Restructure Word title page YAML, revert _bookdown.yml to index.Rmd
- Rename vignettes to uhhthesis-tutorial-en/de
- Slim down intro/methods/results chapters, reorder appendix/acknowledge
</commit_message>
<xml_diff>
--- a/inst/rmarkdown/templates/thesis_word_de/skeleton/uhh-template.docx
+++ b/inst/rmarkdown/templates/thesis_word_de/skeleton/uhh-template.docx
@@ -1,11 +1,12 @@
 
 <file path=word/document.xml><?xml version="1.0" encoding="utf-8"?>
-<w:document xmlns:wpc="http://schemas.microsoft.com/office/word/2010/wordprocessingCanvas" xmlns:cx="http://schemas.microsoft.com/office/drawing/2014/chartex" xmlns:cx1="http://schemas.microsoft.com/office/drawing/2015/9/8/chartex" xmlns:cx2="http://schemas.microsoft.com/office/drawing/2015/10/21/chartex" xmlns:cx3="http://schemas.microsoft.com/office/drawing/2016/5/9/chartex" xmlns:cx4="http://schemas.microsoft.com/office/drawing/2016/5/10/chartex" xmlns:cx5="http://schemas.microsoft.com/office/drawing/2016/5/11/chartex" xmlns:cx6="http://schemas.microsoft.com/office/drawing/2016/5/12/chartex" xmlns:cx7="http://schemas.microsoft.com/office/drawing/2016/5/13/chartex" xmlns:cx8="http://schemas.microsoft.com/office/drawing/2016/5/14/chartex" xmlns:mc="http://schemas.openxmlformats.org/markup-compatibility/2006" xmlns:aink="http://schemas.microsoft.com/office/drawing/2016/ink" xmlns:am3d="http://schemas.microsoft.com/office/drawing/2017/model3d" xmlns:o="urn:schemas-microsoft-com:office:office" xmlns:r="http://schemas.openxmlformats.org/officeDocument/2006/relationships" xmlns:m="http://schemas.openxmlformats.org/officeDocument/2006/math" xmlns:v="urn:schemas-microsoft-com:vml" xmlns:wp14="http://schemas.microsoft.com/office/word/2010/wordprocessingDrawing" xmlns:wp="http://schemas.openxmlformats.org/drawingml/2006/wordprocessingDrawing" xmlns:w10="urn:schemas-microsoft-com:office:word" xmlns:w="http://schemas.openxmlformats.org/wordprocessingml/2006/main" xmlns:w14="http://schemas.microsoft.com/office/word/2010/wordml" xmlns:w15="http://schemas.microsoft.com/office/word/2012/wordml" xmlns:w16cid="http://schemas.microsoft.com/office/word/2016/wordml/cid" xmlns:w16se="http://schemas.microsoft.com/office/word/2015/wordml/symex" xmlns:wpg="http://schemas.microsoft.com/office/word/2010/wordprocessingGroup" xmlns:wpi="http://schemas.microsoft.com/office/word/2010/wordprocessingInk" xmlns:wne="http://schemas.microsoft.com/office/word/2006/wordml" xmlns:wps="http://schemas.microsoft.com/office/word/2010/wordprocessingShape" mc:Ignorable="w14 w15 w16se w16cid wp14">
+<w:document xmlns:wpc="http://schemas.microsoft.com/office/word/2010/wordprocessingCanvas" xmlns:cx="http://schemas.microsoft.com/office/drawing/2014/chartex" xmlns:cx1="http://schemas.microsoft.com/office/drawing/2015/9/8/chartex" xmlns:cx2="http://schemas.microsoft.com/office/drawing/2015/10/21/chartex" xmlns:cx3="http://schemas.microsoft.com/office/drawing/2016/5/9/chartex" xmlns:cx4="http://schemas.microsoft.com/office/drawing/2016/5/10/chartex" xmlns:cx5="http://schemas.microsoft.com/office/drawing/2016/5/11/chartex" xmlns:cx6="http://schemas.microsoft.com/office/drawing/2016/5/12/chartex" xmlns:cx7="http://schemas.microsoft.com/office/drawing/2016/5/13/chartex" xmlns:cx8="http://schemas.microsoft.com/office/drawing/2016/5/14/chartex" xmlns:mc="http://schemas.openxmlformats.org/markup-compatibility/2006" xmlns:aink="http://schemas.microsoft.com/office/drawing/2016/ink" xmlns:am3d="http://schemas.microsoft.com/office/drawing/2017/model3d" xmlns:o="urn:schemas-microsoft-com:office:office" xmlns:oel="http://schemas.microsoft.com/office/2019/extlst" xmlns:r="http://schemas.openxmlformats.org/officeDocument/2006/relationships" xmlns:m="http://schemas.openxmlformats.org/officeDocument/2006/math" xmlns:v="urn:schemas-microsoft-com:vml" xmlns:wp14="http://schemas.microsoft.com/office/word/2010/wordprocessingDrawing" xmlns:wp="http://schemas.openxmlformats.org/drawingml/2006/wordprocessingDrawing" xmlns:w10="urn:schemas-microsoft-com:office:word" xmlns:w="http://schemas.openxmlformats.org/wordprocessingml/2006/main" xmlns:w14="http://schemas.microsoft.com/office/word/2010/wordml" xmlns:w15="http://schemas.microsoft.com/office/word/2012/wordml" xmlns:w16cex="http://schemas.microsoft.com/office/word/2018/wordml/cex" xmlns:w16cid="http://schemas.microsoft.com/office/word/2016/wordml/cid" xmlns:w16="http://schemas.microsoft.com/office/word/2018/wordml" xmlns:w16du="http://schemas.microsoft.com/office/word/2023/wordml/word16du" xmlns:w16sdtdh="http://schemas.microsoft.com/office/word/2020/wordml/sdtdatahash" xmlns:w16sdtfl="http://schemas.microsoft.com/office/word/2024/wordml/sdtformatlock" xmlns:w16se="http://schemas.microsoft.com/office/word/2015/wordml/symex" xmlns:wpg="http://schemas.microsoft.com/office/word/2010/wordprocessingGroup" xmlns:wpi="http://schemas.microsoft.com/office/word/2010/wordprocessingInk" xmlns:wne="http://schemas.microsoft.com/office/word/2006/wordml" xmlns:wps="http://schemas.microsoft.com/office/word/2010/wordprocessingShape" mc:Ignorable="w14 w15 w16se w16cid w16 w16cex w16sdtdh w16sdtfl w16du wp14">
   <w:body>
     <w:p>
+      <w:pPr>
+        <w:pStyle w:val="Datum"/>
+      </w:pPr>
       <w:bookmarkStart w:id="0" w:name="eidesstattliche-versicherung"/>
-      <w:bookmarkStart w:id="1" w:name="_GoBack"/>
-      <w:bookmarkEnd w:id="1"/>
       <w:r>
         <w:t xml:space="preserve"> </w:t>
       </w:r>
@@ -25,7 +26,7 @@
 </file>
 
 <file path=word/endnotes.xml><?xml version="1.0" encoding="utf-8"?>
-<w:endnotes xmlns:wpc="http://schemas.microsoft.com/office/word/2010/wordprocessingCanvas" xmlns:cx="http://schemas.microsoft.com/office/drawing/2014/chartex" xmlns:cx1="http://schemas.microsoft.com/office/drawing/2015/9/8/chartex" xmlns:cx2="http://schemas.microsoft.com/office/drawing/2015/10/21/chartex" xmlns:cx3="http://schemas.microsoft.com/office/drawing/2016/5/9/chartex" xmlns:cx4="http://schemas.microsoft.com/office/drawing/2016/5/10/chartex" xmlns:cx5="http://schemas.microsoft.com/office/drawing/2016/5/11/chartex" xmlns:cx6="http://schemas.microsoft.com/office/drawing/2016/5/12/chartex" xmlns:cx7="http://schemas.microsoft.com/office/drawing/2016/5/13/chartex" xmlns:cx8="http://schemas.microsoft.com/office/drawing/2016/5/14/chartex" xmlns:mc="http://schemas.openxmlformats.org/markup-compatibility/2006" xmlns:aink="http://schemas.microsoft.com/office/drawing/2016/ink" xmlns:am3d="http://schemas.microsoft.com/office/drawing/2017/model3d" xmlns:o="urn:schemas-microsoft-com:office:office" xmlns:r="http://schemas.openxmlformats.org/officeDocument/2006/relationships" xmlns:m="http://schemas.openxmlformats.org/officeDocument/2006/math" xmlns:v="urn:schemas-microsoft-com:vml" xmlns:wp14="http://schemas.microsoft.com/office/word/2010/wordprocessingDrawing" xmlns:wp="http://schemas.openxmlformats.org/drawingml/2006/wordprocessingDrawing" xmlns:w10="urn:schemas-microsoft-com:office:word" xmlns:w="http://schemas.openxmlformats.org/wordprocessingml/2006/main" xmlns:w14="http://schemas.microsoft.com/office/word/2010/wordml" xmlns:w15="http://schemas.microsoft.com/office/word/2012/wordml" xmlns:w16cid="http://schemas.microsoft.com/office/word/2016/wordml/cid" xmlns:w16se="http://schemas.microsoft.com/office/word/2015/wordml/symex" xmlns:wpg="http://schemas.microsoft.com/office/word/2010/wordprocessingGroup" xmlns:wpi="http://schemas.microsoft.com/office/word/2010/wordprocessingInk" xmlns:wne="http://schemas.microsoft.com/office/word/2006/wordml" xmlns:wps="http://schemas.microsoft.com/office/word/2010/wordprocessingShape" mc:Ignorable="w14 w15 w16se w16cid wp14">
+<w:endnotes xmlns:wpc="http://schemas.microsoft.com/office/word/2010/wordprocessingCanvas" xmlns:cx="http://schemas.microsoft.com/office/drawing/2014/chartex" xmlns:cx1="http://schemas.microsoft.com/office/drawing/2015/9/8/chartex" xmlns:cx2="http://schemas.microsoft.com/office/drawing/2015/10/21/chartex" xmlns:cx3="http://schemas.microsoft.com/office/drawing/2016/5/9/chartex" xmlns:cx4="http://schemas.microsoft.com/office/drawing/2016/5/10/chartex" xmlns:cx5="http://schemas.microsoft.com/office/drawing/2016/5/11/chartex" xmlns:cx6="http://schemas.microsoft.com/office/drawing/2016/5/12/chartex" xmlns:cx7="http://schemas.microsoft.com/office/drawing/2016/5/13/chartex" xmlns:cx8="http://schemas.microsoft.com/office/drawing/2016/5/14/chartex" xmlns:mc="http://schemas.openxmlformats.org/markup-compatibility/2006" xmlns:aink="http://schemas.microsoft.com/office/drawing/2016/ink" xmlns:am3d="http://schemas.microsoft.com/office/drawing/2017/model3d" xmlns:o="urn:schemas-microsoft-com:office:office" xmlns:oel="http://schemas.microsoft.com/office/2019/extlst" xmlns:r="http://schemas.openxmlformats.org/officeDocument/2006/relationships" xmlns:m="http://schemas.openxmlformats.org/officeDocument/2006/math" xmlns:v="urn:schemas-microsoft-com:vml" xmlns:wp14="http://schemas.microsoft.com/office/word/2010/wordprocessingDrawing" xmlns:wp="http://schemas.openxmlformats.org/drawingml/2006/wordprocessingDrawing" xmlns:w10="urn:schemas-microsoft-com:office:word" xmlns:w="http://schemas.openxmlformats.org/wordprocessingml/2006/main" xmlns:w14="http://schemas.microsoft.com/office/word/2010/wordml" xmlns:w15="http://schemas.microsoft.com/office/word/2012/wordml" xmlns:w16cex="http://schemas.microsoft.com/office/word/2018/wordml/cex" xmlns:w16cid="http://schemas.microsoft.com/office/word/2016/wordml/cid" xmlns:w16="http://schemas.microsoft.com/office/word/2018/wordml" xmlns:w16du="http://schemas.microsoft.com/office/word/2023/wordml/word16du" xmlns:w16sdtdh="http://schemas.microsoft.com/office/word/2020/wordml/sdtdatahash" xmlns:w16sdtfl="http://schemas.microsoft.com/office/word/2024/wordml/sdtformatlock" xmlns:w16se="http://schemas.microsoft.com/office/word/2015/wordml/symex" xmlns:wpg="http://schemas.microsoft.com/office/word/2010/wordprocessingGroup" xmlns:wpi="http://schemas.microsoft.com/office/word/2010/wordprocessingInk" xmlns:wne="http://schemas.microsoft.com/office/word/2006/wordml" xmlns:wps="http://schemas.microsoft.com/office/word/2010/wordprocessingShape" mc:Ignorable="w14 w15 w16se w16cid w16 w16cex w16sdtdh w16sdtfl w16du wp14">
   <w:endnote w:type="separator" w:id="-1">
     <w:p>
       <w:pPr>
@@ -50,7 +51,7 @@
 </file>
 
 <file path=word/footer1.xml><?xml version="1.0" encoding="utf-8"?>
-<w:ftr xmlns:wpc="http://schemas.microsoft.com/office/word/2010/wordprocessingCanvas" xmlns:cx="http://schemas.microsoft.com/office/drawing/2014/chartex" xmlns:cx1="http://schemas.microsoft.com/office/drawing/2015/9/8/chartex" xmlns:cx2="http://schemas.microsoft.com/office/drawing/2015/10/21/chartex" xmlns:cx3="http://schemas.microsoft.com/office/drawing/2016/5/9/chartex" xmlns:cx4="http://schemas.microsoft.com/office/drawing/2016/5/10/chartex" xmlns:cx5="http://schemas.microsoft.com/office/drawing/2016/5/11/chartex" xmlns:cx6="http://schemas.microsoft.com/office/drawing/2016/5/12/chartex" xmlns:cx7="http://schemas.microsoft.com/office/drawing/2016/5/13/chartex" xmlns:cx8="http://schemas.microsoft.com/office/drawing/2016/5/14/chartex" xmlns:mc="http://schemas.openxmlformats.org/markup-compatibility/2006" xmlns:aink="http://schemas.microsoft.com/office/drawing/2016/ink" xmlns:am3d="http://schemas.microsoft.com/office/drawing/2017/model3d" xmlns:o="urn:schemas-microsoft-com:office:office" xmlns:r="http://schemas.openxmlformats.org/officeDocument/2006/relationships" xmlns:m="http://schemas.openxmlformats.org/officeDocument/2006/math" xmlns:v="urn:schemas-microsoft-com:vml" xmlns:wp14="http://schemas.microsoft.com/office/word/2010/wordprocessingDrawing" xmlns:wp="http://schemas.openxmlformats.org/drawingml/2006/wordprocessingDrawing" xmlns:w10="urn:schemas-microsoft-com:office:word" xmlns:w="http://schemas.openxmlformats.org/wordprocessingml/2006/main" xmlns:w14="http://schemas.microsoft.com/office/word/2010/wordml" xmlns:w15="http://schemas.microsoft.com/office/word/2012/wordml" xmlns:w16cid="http://schemas.microsoft.com/office/word/2016/wordml/cid" xmlns:w16se="http://schemas.microsoft.com/office/word/2015/wordml/symex" xmlns:wpg="http://schemas.microsoft.com/office/word/2010/wordprocessingGroup" xmlns:wpi="http://schemas.microsoft.com/office/word/2010/wordprocessingInk" xmlns:wne="http://schemas.microsoft.com/office/word/2006/wordml" xmlns:wps="http://schemas.microsoft.com/office/word/2010/wordprocessingShape" mc:Ignorable="w14 w15 w16se w16cid wp14">
+<w:ftr xmlns:wpc="http://schemas.microsoft.com/office/word/2010/wordprocessingCanvas" xmlns:cx="http://schemas.microsoft.com/office/drawing/2014/chartex" xmlns:cx1="http://schemas.microsoft.com/office/drawing/2015/9/8/chartex" xmlns:cx2="http://schemas.microsoft.com/office/drawing/2015/10/21/chartex" xmlns:cx3="http://schemas.microsoft.com/office/drawing/2016/5/9/chartex" xmlns:cx4="http://schemas.microsoft.com/office/drawing/2016/5/10/chartex" xmlns:cx5="http://schemas.microsoft.com/office/drawing/2016/5/11/chartex" xmlns:cx6="http://schemas.microsoft.com/office/drawing/2016/5/12/chartex" xmlns:cx7="http://schemas.microsoft.com/office/drawing/2016/5/13/chartex" xmlns:cx8="http://schemas.microsoft.com/office/drawing/2016/5/14/chartex" xmlns:mc="http://schemas.openxmlformats.org/markup-compatibility/2006" xmlns:aink="http://schemas.microsoft.com/office/drawing/2016/ink" xmlns:am3d="http://schemas.microsoft.com/office/drawing/2017/model3d" xmlns:o="urn:schemas-microsoft-com:office:office" xmlns:oel="http://schemas.microsoft.com/office/2019/extlst" xmlns:r="http://schemas.openxmlformats.org/officeDocument/2006/relationships" xmlns:m="http://schemas.openxmlformats.org/officeDocument/2006/math" xmlns:v="urn:schemas-microsoft-com:vml" xmlns:wp14="http://schemas.microsoft.com/office/word/2010/wordprocessingDrawing" xmlns:wp="http://schemas.openxmlformats.org/drawingml/2006/wordprocessingDrawing" xmlns:w10="urn:schemas-microsoft-com:office:word" xmlns:w="http://schemas.openxmlformats.org/wordprocessingml/2006/main" xmlns:w14="http://schemas.microsoft.com/office/word/2010/wordml" xmlns:w15="http://schemas.microsoft.com/office/word/2012/wordml" xmlns:w16cex="http://schemas.microsoft.com/office/word/2018/wordml/cex" xmlns:w16cid="http://schemas.microsoft.com/office/word/2016/wordml/cid" xmlns:w16="http://schemas.microsoft.com/office/word/2018/wordml" xmlns:w16du="http://schemas.microsoft.com/office/word/2023/wordml/word16du" xmlns:w16sdtdh="http://schemas.microsoft.com/office/word/2020/wordml/sdtdatahash" xmlns:w16sdtfl="http://schemas.microsoft.com/office/word/2024/wordml/sdtformatlock" xmlns:w16se="http://schemas.microsoft.com/office/word/2015/wordml/symex" xmlns:wpg="http://schemas.microsoft.com/office/word/2010/wordprocessingGroup" xmlns:wpi="http://schemas.microsoft.com/office/word/2010/wordprocessingInk" xmlns:wne="http://schemas.microsoft.com/office/word/2006/wordml" xmlns:wps="http://schemas.microsoft.com/office/word/2010/wordprocessingShape" mc:Ignorable="w14 w15 w16se w16cid w16 w16cex w16sdtdh w16sdtfl w16du wp14">
   <w:sdt>
     <w:sdtPr>
       <w:rPr>
@@ -62,11 +63,6 @@
         <w:docPartUnique/>
       </w:docPartObj>
     </w:sdtPr>
-    <w:sdtEndPr>
-      <w:rPr>
-        <w:rStyle w:val="Seitenzahl"/>
-      </w:rPr>
-    </w:sdtEndPr>
     <w:sdtContent>
       <w:p>
         <w:pPr>
@@ -107,7 +103,7 @@
 </file>
 
 <file path=word/footer2.xml><?xml version="1.0" encoding="utf-8"?>
-<w:ftr xmlns:wpc="http://schemas.microsoft.com/office/word/2010/wordprocessingCanvas" xmlns:cx="http://schemas.microsoft.com/office/drawing/2014/chartex" xmlns:cx1="http://schemas.microsoft.com/office/drawing/2015/9/8/chartex" xmlns:cx2="http://schemas.microsoft.com/office/drawing/2015/10/21/chartex" xmlns:cx3="http://schemas.microsoft.com/office/drawing/2016/5/9/chartex" xmlns:cx4="http://schemas.microsoft.com/office/drawing/2016/5/10/chartex" xmlns:cx5="http://schemas.microsoft.com/office/drawing/2016/5/11/chartex" xmlns:cx6="http://schemas.microsoft.com/office/drawing/2016/5/12/chartex" xmlns:cx7="http://schemas.microsoft.com/office/drawing/2016/5/13/chartex" xmlns:cx8="http://schemas.microsoft.com/office/drawing/2016/5/14/chartex" xmlns:mc="http://schemas.openxmlformats.org/markup-compatibility/2006" xmlns:aink="http://schemas.microsoft.com/office/drawing/2016/ink" xmlns:am3d="http://schemas.microsoft.com/office/drawing/2017/model3d" xmlns:o="urn:schemas-microsoft-com:office:office" xmlns:r="http://schemas.openxmlformats.org/officeDocument/2006/relationships" xmlns:m="http://schemas.openxmlformats.org/officeDocument/2006/math" xmlns:v="urn:schemas-microsoft-com:vml" xmlns:wp14="http://schemas.microsoft.com/office/word/2010/wordprocessingDrawing" xmlns:wp="http://schemas.openxmlformats.org/drawingml/2006/wordprocessingDrawing" xmlns:w10="urn:schemas-microsoft-com:office:word" xmlns:w="http://schemas.openxmlformats.org/wordprocessingml/2006/main" xmlns:w14="http://schemas.microsoft.com/office/word/2010/wordml" xmlns:w15="http://schemas.microsoft.com/office/word/2012/wordml" xmlns:w16cid="http://schemas.microsoft.com/office/word/2016/wordml/cid" xmlns:w16se="http://schemas.microsoft.com/office/word/2015/wordml/symex" xmlns:wpg="http://schemas.microsoft.com/office/word/2010/wordprocessingGroup" xmlns:wpi="http://schemas.microsoft.com/office/word/2010/wordprocessingInk" xmlns:wne="http://schemas.microsoft.com/office/word/2006/wordml" xmlns:wps="http://schemas.microsoft.com/office/word/2010/wordprocessingShape" mc:Ignorable="w14 w15 w16se w16cid wp14">
+<w:ftr xmlns:wpc="http://schemas.microsoft.com/office/word/2010/wordprocessingCanvas" xmlns:cx="http://schemas.microsoft.com/office/drawing/2014/chartex" xmlns:cx1="http://schemas.microsoft.com/office/drawing/2015/9/8/chartex" xmlns:cx2="http://schemas.microsoft.com/office/drawing/2015/10/21/chartex" xmlns:cx3="http://schemas.microsoft.com/office/drawing/2016/5/9/chartex" xmlns:cx4="http://schemas.microsoft.com/office/drawing/2016/5/10/chartex" xmlns:cx5="http://schemas.microsoft.com/office/drawing/2016/5/11/chartex" xmlns:cx6="http://schemas.microsoft.com/office/drawing/2016/5/12/chartex" xmlns:cx7="http://schemas.microsoft.com/office/drawing/2016/5/13/chartex" xmlns:cx8="http://schemas.microsoft.com/office/drawing/2016/5/14/chartex" xmlns:mc="http://schemas.openxmlformats.org/markup-compatibility/2006" xmlns:aink="http://schemas.microsoft.com/office/drawing/2016/ink" xmlns:am3d="http://schemas.microsoft.com/office/drawing/2017/model3d" xmlns:o="urn:schemas-microsoft-com:office:office" xmlns:oel="http://schemas.microsoft.com/office/2019/extlst" xmlns:r="http://schemas.openxmlformats.org/officeDocument/2006/relationships" xmlns:m="http://schemas.openxmlformats.org/officeDocument/2006/math" xmlns:v="urn:schemas-microsoft-com:vml" xmlns:wp14="http://schemas.microsoft.com/office/word/2010/wordprocessingDrawing" xmlns:wp="http://schemas.openxmlformats.org/drawingml/2006/wordprocessingDrawing" xmlns:w10="urn:schemas-microsoft-com:office:word" xmlns:w="http://schemas.openxmlformats.org/wordprocessingml/2006/main" xmlns:w14="http://schemas.microsoft.com/office/word/2010/wordml" xmlns:w15="http://schemas.microsoft.com/office/word/2012/wordml" xmlns:w16cex="http://schemas.microsoft.com/office/word/2018/wordml/cex" xmlns:w16cid="http://schemas.microsoft.com/office/word/2016/wordml/cid" xmlns:w16="http://schemas.microsoft.com/office/word/2018/wordml" xmlns:w16du="http://schemas.microsoft.com/office/word/2023/wordml/word16du" xmlns:w16sdtdh="http://schemas.microsoft.com/office/word/2020/wordml/sdtdatahash" xmlns:w16sdtfl="http://schemas.microsoft.com/office/word/2024/wordml/sdtformatlock" xmlns:w16se="http://schemas.microsoft.com/office/word/2015/wordml/symex" xmlns:wpg="http://schemas.microsoft.com/office/word/2010/wordprocessingGroup" xmlns:wpi="http://schemas.microsoft.com/office/word/2010/wordprocessingInk" xmlns:wne="http://schemas.microsoft.com/office/word/2006/wordml" xmlns:wps="http://schemas.microsoft.com/office/word/2010/wordprocessingShape" mc:Ignorable="w14 w15 w16se w16cid w16 w16cex w16sdtdh w16sdtfl w16du wp14">
   <w:sdt>
     <w:sdtPr>
       <w:rPr>
@@ -119,11 +115,6 @@
         <w:docPartUnique/>
       </w:docPartObj>
     </w:sdtPr>
-    <w:sdtEndPr>
-      <w:rPr>
-        <w:rStyle w:val="Seitenzahl"/>
-      </w:rPr>
-    </w:sdtEndPr>
     <w:sdtContent>
       <w:p>
         <w:pPr>
@@ -177,7 +168,7 @@
 </file>
 
 <file path=word/footnotes.xml><?xml version="1.0" encoding="utf-8"?>
-<w:footnotes xmlns:wpc="http://schemas.microsoft.com/office/word/2010/wordprocessingCanvas" xmlns:cx="http://schemas.microsoft.com/office/drawing/2014/chartex" xmlns:cx1="http://schemas.microsoft.com/office/drawing/2015/9/8/chartex" xmlns:cx2="http://schemas.microsoft.com/office/drawing/2015/10/21/chartex" xmlns:cx3="http://schemas.microsoft.com/office/drawing/2016/5/9/chartex" xmlns:cx4="http://schemas.microsoft.com/office/drawing/2016/5/10/chartex" xmlns:cx5="http://schemas.microsoft.com/office/drawing/2016/5/11/chartex" xmlns:cx6="http://schemas.microsoft.com/office/drawing/2016/5/12/chartex" xmlns:cx7="http://schemas.microsoft.com/office/drawing/2016/5/13/chartex" xmlns:cx8="http://schemas.microsoft.com/office/drawing/2016/5/14/chartex" xmlns:mc="http://schemas.openxmlformats.org/markup-compatibility/2006" xmlns:aink="http://schemas.microsoft.com/office/drawing/2016/ink" xmlns:am3d="http://schemas.microsoft.com/office/drawing/2017/model3d" xmlns:o="urn:schemas-microsoft-com:office:office" xmlns:r="http://schemas.openxmlformats.org/officeDocument/2006/relationships" xmlns:m="http://schemas.openxmlformats.org/officeDocument/2006/math" xmlns:v="urn:schemas-microsoft-com:vml" xmlns:wp14="http://schemas.microsoft.com/office/word/2010/wordprocessingDrawing" xmlns:wp="http://schemas.openxmlformats.org/drawingml/2006/wordprocessingDrawing" xmlns:w10="urn:schemas-microsoft-com:office:word" xmlns:w="http://schemas.openxmlformats.org/wordprocessingml/2006/main" xmlns:w14="http://schemas.microsoft.com/office/word/2010/wordml" xmlns:w15="http://schemas.microsoft.com/office/word/2012/wordml" xmlns:w16cid="http://schemas.microsoft.com/office/word/2016/wordml/cid" xmlns:w16se="http://schemas.microsoft.com/office/word/2015/wordml/symex" xmlns:wpg="http://schemas.microsoft.com/office/word/2010/wordprocessingGroup" xmlns:wpi="http://schemas.microsoft.com/office/word/2010/wordprocessingInk" xmlns:wne="http://schemas.microsoft.com/office/word/2006/wordml" xmlns:wps="http://schemas.microsoft.com/office/word/2010/wordprocessingShape" mc:Ignorable="w14 w15 w16se w16cid wp14">
+<w:footnotes xmlns:wpc="http://schemas.microsoft.com/office/word/2010/wordprocessingCanvas" xmlns:cx="http://schemas.microsoft.com/office/drawing/2014/chartex" xmlns:cx1="http://schemas.microsoft.com/office/drawing/2015/9/8/chartex" xmlns:cx2="http://schemas.microsoft.com/office/drawing/2015/10/21/chartex" xmlns:cx3="http://schemas.microsoft.com/office/drawing/2016/5/9/chartex" xmlns:cx4="http://schemas.microsoft.com/office/drawing/2016/5/10/chartex" xmlns:cx5="http://schemas.microsoft.com/office/drawing/2016/5/11/chartex" xmlns:cx6="http://schemas.microsoft.com/office/drawing/2016/5/12/chartex" xmlns:cx7="http://schemas.microsoft.com/office/drawing/2016/5/13/chartex" xmlns:cx8="http://schemas.microsoft.com/office/drawing/2016/5/14/chartex" xmlns:mc="http://schemas.openxmlformats.org/markup-compatibility/2006" xmlns:aink="http://schemas.microsoft.com/office/drawing/2016/ink" xmlns:am3d="http://schemas.microsoft.com/office/drawing/2017/model3d" xmlns:o="urn:schemas-microsoft-com:office:office" xmlns:oel="http://schemas.microsoft.com/office/2019/extlst" xmlns:r="http://schemas.openxmlformats.org/officeDocument/2006/relationships" xmlns:m="http://schemas.openxmlformats.org/officeDocument/2006/math" xmlns:v="urn:schemas-microsoft-com:vml" xmlns:wp14="http://schemas.microsoft.com/office/word/2010/wordprocessingDrawing" xmlns:wp="http://schemas.openxmlformats.org/drawingml/2006/wordprocessingDrawing" xmlns:w10="urn:schemas-microsoft-com:office:word" xmlns:w="http://schemas.openxmlformats.org/wordprocessingml/2006/main" xmlns:w14="http://schemas.microsoft.com/office/word/2010/wordml" xmlns:w15="http://schemas.microsoft.com/office/word/2012/wordml" xmlns:w16cex="http://schemas.microsoft.com/office/word/2018/wordml/cex" xmlns:w16cid="http://schemas.microsoft.com/office/word/2016/wordml/cid" xmlns:w16="http://schemas.microsoft.com/office/word/2018/wordml" xmlns:w16du="http://schemas.microsoft.com/office/word/2023/wordml/word16du" xmlns:w16sdtdh="http://schemas.microsoft.com/office/word/2020/wordml/sdtdatahash" xmlns:w16sdtfl="http://schemas.microsoft.com/office/word/2024/wordml/sdtformatlock" xmlns:w16se="http://schemas.microsoft.com/office/word/2015/wordml/symex" xmlns:wpg="http://schemas.microsoft.com/office/word/2010/wordprocessingGroup" xmlns:wpi="http://schemas.microsoft.com/office/word/2010/wordprocessingInk" xmlns:wne="http://schemas.microsoft.com/office/word/2006/wordml" xmlns:wps="http://schemas.microsoft.com/office/word/2010/wordprocessingShape" mc:Ignorable="w14 w15 w16se w16cid w16 w16cex w16sdtdh w16sdtfl w16du wp14">
   <w:footnote w:type="separator" w:id="-1">
     <w:p>
       <w:r>
@@ -196,7 +187,7 @@
 </file>
 
 <file path=word/header1.xml><?xml version="1.0" encoding="utf-8"?>
-<w:hdr xmlns:wpc="http://schemas.microsoft.com/office/word/2010/wordprocessingCanvas" xmlns:cx="http://schemas.microsoft.com/office/drawing/2014/chartex" xmlns:cx1="http://schemas.microsoft.com/office/drawing/2015/9/8/chartex" xmlns:cx2="http://schemas.microsoft.com/office/drawing/2015/10/21/chartex" xmlns:cx3="http://schemas.microsoft.com/office/drawing/2016/5/9/chartex" xmlns:cx4="http://schemas.microsoft.com/office/drawing/2016/5/10/chartex" xmlns:cx5="http://schemas.microsoft.com/office/drawing/2016/5/11/chartex" xmlns:cx6="http://schemas.microsoft.com/office/drawing/2016/5/12/chartex" xmlns:cx7="http://schemas.microsoft.com/office/drawing/2016/5/13/chartex" xmlns:cx8="http://schemas.microsoft.com/office/drawing/2016/5/14/chartex" xmlns:mc="http://schemas.openxmlformats.org/markup-compatibility/2006" xmlns:aink="http://schemas.microsoft.com/office/drawing/2016/ink" xmlns:am3d="http://schemas.microsoft.com/office/drawing/2017/model3d" xmlns:o="urn:schemas-microsoft-com:office:office" xmlns:r="http://schemas.openxmlformats.org/officeDocument/2006/relationships" xmlns:m="http://schemas.openxmlformats.org/officeDocument/2006/math" xmlns:v="urn:schemas-microsoft-com:vml" xmlns:wp14="http://schemas.microsoft.com/office/word/2010/wordprocessingDrawing" xmlns:wp="http://schemas.openxmlformats.org/drawingml/2006/wordprocessingDrawing" xmlns:w10="urn:schemas-microsoft-com:office:word" xmlns:w="http://schemas.openxmlformats.org/wordprocessingml/2006/main" xmlns:w14="http://schemas.microsoft.com/office/word/2010/wordml" xmlns:w15="http://schemas.microsoft.com/office/word/2012/wordml" xmlns:w16cid="http://schemas.microsoft.com/office/word/2016/wordml/cid" xmlns:w16se="http://schemas.microsoft.com/office/word/2015/wordml/symex" xmlns:wpg="http://schemas.microsoft.com/office/word/2010/wordprocessingGroup" xmlns:wpi="http://schemas.microsoft.com/office/word/2010/wordprocessingInk" xmlns:wne="http://schemas.microsoft.com/office/word/2006/wordml" xmlns:wps="http://schemas.microsoft.com/office/word/2010/wordprocessingShape" mc:Ignorable="w14 w15 w16se w16cid wp14">
+<w:hdr xmlns:wpc="http://schemas.microsoft.com/office/word/2010/wordprocessingCanvas" xmlns:cx="http://schemas.microsoft.com/office/drawing/2014/chartex" xmlns:cx1="http://schemas.microsoft.com/office/drawing/2015/9/8/chartex" xmlns:cx2="http://schemas.microsoft.com/office/drawing/2015/10/21/chartex" xmlns:cx3="http://schemas.microsoft.com/office/drawing/2016/5/9/chartex" xmlns:cx4="http://schemas.microsoft.com/office/drawing/2016/5/10/chartex" xmlns:cx5="http://schemas.microsoft.com/office/drawing/2016/5/11/chartex" xmlns:cx6="http://schemas.microsoft.com/office/drawing/2016/5/12/chartex" xmlns:cx7="http://schemas.microsoft.com/office/drawing/2016/5/13/chartex" xmlns:cx8="http://schemas.microsoft.com/office/drawing/2016/5/14/chartex" xmlns:mc="http://schemas.openxmlformats.org/markup-compatibility/2006" xmlns:aink="http://schemas.microsoft.com/office/drawing/2016/ink" xmlns:am3d="http://schemas.microsoft.com/office/drawing/2017/model3d" xmlns:o="urn:schemas-microsoft-com:office:office" xmlns:oel="http://schemas.microsoft.com/office/2019/extlst" xmlns:r="http://schemas.openxmlformats.org/officeDocument/2006/relationships" xmlns:m="http://schemas.openxmlformats.org/officeDocument/2006/math" xmlns:v="urn:schemas-microsoft-com:vml" xmlns:wp14="http://schemas.microsoft.com/office/word/2010/wordprocessingDrawing" xmlns:wp="http://schemas.openxmlformats.org/drawingml/2006/wordprocessingDrawing" xmlns:w10="urn:schemas-microsoft-com:office:word" xmlns:w="http://schemas.openxmlformats.org/wordprocessingml/2006/main" xmlns:w14="http://schemas.microsoft.com/office/word/2010/wordml" xmlns:w15="http://schemas.microsoft.com/office/word/2012/wordml" xmlns:w16cex="http://schemas.microsoft.com/office/word/2018/wordml/cex" xmlns:w16cid="http://schemas.microsoft.com/office/word/2016/wordml/cid" xmlns:w16="http://schemas.microsoft.com/office/word/2018/wordml" xmlns:w16du="http://schemas.microsoft.com/office/word/2023/wordml/word16du" xmlns:w16sdtdh="http://schemas.microsoft.com/office/word/2020/wordml/sdtdatahash" xmlns:w16sdtfl="http://schemas.microsoft.com/office/word/2024/wordml/sdtformatlock" xmlns:w16se="http://schemas.microsoft.com/office/word/2015/wordml/symex" xmlns:wpg="http://schemas.microsoft.com/office/word/2010/wordprocessingGroup" xmlns:wpi="http://schemas.microsoft.com/office/word/2010/wordprocessingInk" xmlns:wne="http://schemas.microsoft.com/office/word/2006/wordml" xmlns:wps="http://schemas.microsoft.com/office/word/2010/wordprocessingShape" mc:Ignorable="w14 w15 w16se w16cid w16 w16cex w16sdtdh w16sdtfl w16du wp14">
   <w:p>
     <w:pPr>
       <w:pStyle w:val="Kopfzeile"/>
@@ -212,7 +203,7 @@
         <w:noProof/>
       </w:rPr>
       <w:drawing>
-        <wp:inline distT="0" distB="0" distL="0" distR="0">
+        <wp:inline distT="0" distB="0" distL="0" distR="0" wp14:anchorId="3B2C3338" wp14:editId="29B5B35A">
           <wp:extent cx="2442310" cy="820616"/>
           <wp:effectExtent l="0" t="0" r="0" b="5080"/>
           <wp:docPr id="2" name="Grafik 2"/>
@@ -261,7 +252,7 @@
         <w:noProof/>
       </w:rPr>
       <w:drawing>
-        <wp:inline distT="0" distB="0" distL="0" distR="0">
+        <wp:inline distT="0" distB="0" distL="0" distR="0" wp14:anchorId="3AAE4C87" wp14:editId="4BBA9FCC">
           <wp:extent cx="2670257" cy="586154"/>
           <wp:effectExtent l="0" t="0" r="0" b="0"/>
           <wp:docPr id="3" name="Grafik 3"/>
@@ -318,39 +309,18 @@
   <w:p>
     <w:pPr>
       <w:pStyle w:val="Kopfzeile"/>
-      <w:jc w:val="both"/>
-    </w:pPr>
-  </w:p>
-  <w:p>
-    <w:pPr>
-      <w:pStyle w:val="Kopfzeile"/>
-      <w:jc w:val="both"/>
-    </w:pPr>
-  </w:p>
-  <w:p>
-    <w:pPr>
-      <w:pStyle w:val="Kopfzeile"/>
-      <w:jc w:val="center"/>
       <w:rPr>
         <w:b/>
         <w:sz w:val="32"/>
         <w:szCs w:val="32"/>
       </w:rPr>
     </w:pPr>
-    <w:r>
-      <w:rPr>
-        <w:b/>
-        <w:sz w:val="32"/>
-        <w:szCs w:val="32"/>
-      </w:rPr>
-      <w:t>Bachelorarbeit /Masterarbeit</w:t>
-    </w:r>
   </w:p>
 </w:hdr>
 </file>
 
 <file path=word/numbering.xml><?xml version="1.0" encoding="utf-8"?>
-<w:numbering xmlns:wpc="http://schemas.microsoft.com/office/word/2010/wordprocessingCanvas" xmlns:cx="http://schemas.microsoft.com/office/drawing/2014/chartex" xmlns:cx1="http://schemas.microsoft.com/office/drawing/2015/9/8/chartex" xmlns:cx2="http://schemas.microsoft.com/office/drawing/2015/10/21/chartex" xmlns:cx3="http://schemas.microsoft.com/office/drawing/2016/5/9/chartex" xmlns:cx4="http://schemas.microsoft.com/office/drawing/2016/5/10/chartex" xmlns:cx5="http://schemas.microsoft.com/office/drawing/2016/5/11/chartex" xmlns:cx6="http://schemas.microsoft.com/office/drawing/2016/5/12/chartex" xmlns:cx7="http://schemas.microsoft.com/office/drawing/2016/5/13/chartex" xmlns:cx8="http://schemas.microsoft.com/office/drawing/2016/5/14/chartex" xmlns:mc="http://schemas.openxmlformats.org/markup-compatibility/2006" xmlns:aink="http://schemas.microsoft.com/office/drawing/2016/ink" xmlns:am3d="http://schemas.microsoft.com/office/drawing/2017/model3d" xmlns:o="urn:schemas-microsoft-com:office:office" xmlns:r="http://schemas.openxmlformats.org/officeDocument/2006/relationships" xmlns:m="http://schemas.openxmlformats.org/officeDocument/2006/math" xmlns:v="urn:schemas-microsoft-com:vml" xmlns:wp14="http://schemas.microsoft.com/office/word/2010/wordprocessingDrawing" xmlns:wp="http://schemas.openxmlformats.org/drawingml/2006/wordprocessingDrawing" xmlns:w10="urn:schemas-microsoft-com:office:word" xmlns:w="http://schemas.openxmlformats.org/wordprocessingml/2006/main" xmlns:w14="http://schemas.microsoft.com/office/word/2010/wordml" xmlns:w15="http://schemas.microsoft.com/office/word/2012/wordml" xmlns:w16cid="http://schemas.microsoft.com/office/word/2016/wordml/cid" xmlns:w16se="http://schemas.microsoft.com/office/word/2015/wordml/symex" xmlns:wpg="http://schemas.microsoft.com/office/word/2010/wordprocessingGroup" xmlns:wpi="http://schemas.microsoft.com/office/word/2010/wordprocessingInk" xmlns:wne="http://schemas.microsoft.com/office/word/2006/wordml" xmlns:wps="http://schemas.microsoft.com/office/word/2010/wordprocessingShape" mc:Ignorable="w14 w15 w16se w16cid wp14">
+<w:numbering xmlns:wpc="http://schemas.microsoft.com/office/word/2010/wordprocessingCanvas" xmlns:cx="http://schemas.microsoft.com/office/drawing/2014/chartex" xmlns:cx1="http://schemas.microsoft.com/office/drawing/2015/9/8/chartex" xmlns:cx2="http://schemas.microsoft.com/office/drawing/2015/10/21/chartex" xmlns:cx3="http://schemas.microsoft.com/office/drawing/2016/5/9/chartex" xmlns:cx4="http://schemas.microsoft.com/office/drawing/2016/5/10/chartex" xmlns:cx5="http://schemas.microsoft.com/office/drawing/2016/5/11/chartex" xmlns:cx6="http://schemas.microsoft.com/office/drawing/2016/5/12/chartex" xmlns:cx7="http://schemas.microsoft.com/office/drawing/2016/5/13/chartex" xmlns:cx8="http://schemas.microsoft.com/office/drawing/2016/5/14/chartex" xmlns:mc="http://schemas.openxmlformats.org/markup-compatibility/2006" xmlns:aink="http://schemas.microsoft.com/office/drawing/2016/ink" xmlns:am3d="http://schemas.microsoft.com/office/drawing/2017/model3d" xmlns:o="urn:schemas-microsoft-com:office:office" xmlns:oel="http://schemas.microsoft.com/office/2019/extlst" xmlns:r="http://schemas.openxmlformats.org/officeDocument/2006/relationships" xmlns:m="http://schemas.openxmlformats.org/officeDocument/2006/math" xmlns:v="urn:schemas-microsoft-com:vml" xmlns:wp14="http://schemas.microsoft.com/office/word/2010/wordprocessingDrawing" xmlns:wp="http://schemas.openxmlformats.org/drawingml/2006/wordprocessingDrawing" xmlns:w10="urn:schemas-microsoft-com:office:word" xmlns:w="http://schemas.openxmlformats.org/wordprocessingml/2006/main" xmlns:w14="http://schemas.microsoft.com/office/word/2010/wordml" xmlns:w15="http://schemas.microsoft.com/office/word/2012/wordml" xmlns:w16cex="http://schemas.microsoft.com/office/word/2018/wordml/cex" xmlns:w16cid="http://schemas.microsoft.com/office/word/2016/wordml/cid" xmlns:w16="http://schemas.microsoft.com/office/word/2018/wordml" xmlns:w16du="http://schemas.microsoft.com/office/word/2023/wordml/word16du" xmlns:w16sdtdh="http://schemas.microsoft.com/office/word/2020/wordml/sdtdatahash" xmlns:w16sdtfl="http://schemas.microsoft.com/office/word/2024/wordml/sdtformatlock" xmlns:w16se="http://schemas.microsoft.com/office/word/2015/wordml/symex" xmlns:wpg="http://schemas.microsoft.com/office/word/2010/wordprocessingGroup" xmlns:wpi="http://schemas.microsoft.com/office/word/2010/wordprocessingInk" xmlns:wne="http://schemas.microsoft.com/office/word/2006/wordml" xmlns:wps="http://schemas.microsoft.com/office/word/2010/wordprocessingShape" mc:Ignorable="w14 w15 w16se w16cid w16 w16cex w16sdtdh w16sdtfl w16du wp14">
   <w:abstractNum w:abstractNumId="0" w15:restartNumberingAfterBreak="0">
     <w:nsid w:val="FFFFFF7C"/>
     <w:multiLevelType w:val="singleLevel"/>
@@ -776,19 +746,19 @@
       </w:pPr>
     </w:lvl>
   </w:abstractNum>
-  <w:num w:numId="1">
+  <w:num w:numId="1" w16cid:durableId="1821773525">
     <w:abstractNumId w:val="10"/>
   </w:num>
-  <w:num w:numId="2">
+  <w:num w:numId="2" w16cid:durableId="1929342979">
     <w:abstractNumId w:val="11"/>
   </w:num>
-  <w:num w:numId="3">
+  <w:num w:numId="3" w16cid:durableId="1763649972">
     <w:abstractNumId w:val="11"/>
   </w:num>
-  <w:num w:numId="4">
+  <w:num w:numId="4" w16cid:durableId="1898666130">
     <w:abstractNumId w:val="11"/>
   </w:num>
-  <w:num w:numId="5">
+  <w:num w:numId="5" w16cid:durableId="1567228910">
     <w:abstractNumId w:val="12"/>
     <w:lvlOverride w:ilvl="0">
       <w:startOverride w:val="1"/>
@@ -818,10 +788,10 @@
       <w:startOverride w:val="1"/>
     </w:lvlOverride>
   </w:num>
-  <w:num w:numId="6">
+  <w:num w:numId="6" w16cid:durableId="169293031">
     <w:abstractNumId w:val="11"/>
   </w:num>
-  <w:num w:numId="7">
+  <w:num w:numId="7" w16cid:durableId="598026880">
     <w:abstractNumId w:val="12"/>
     <w:lvlOverride w:ilvl="0">
       <w:startOverride w:val="1"/>
@@ -851,62 +821,62 @@
       <w:startOverride w:val="1"/>
     </w:lvlOverride>
   </w:num>
-  <w:num w:numId="8">
+  <w:num w:numId="8" w16cid:durableId="1732656389">
     <w:abstractNumId w:val="11"/>
   </w:num>
-  <w:num w:numId="9">
+  <w:num w:numId="9" w16cid:durableId="1429932315">
     <w:abstractNumId w:val="11"/>
   </w:num>
-  <w:num w:numId="10">
+  <w:num w:numId="10" w16cid:durableId="1250310173">
     <w:abstractNumId w:val="11"/>
   </w:num>
-  <w:num w:numId="11">
+  <w:num w:numId="11" w16cid:durableId="1187215458">
     <w:abstractNumId w:val="11"/>
   </w:num>
-  <w:num w:numId="12">
+  <w:num w:numId="12" w16cid:durableId="1953635327">
     <w:abstractNumId w:val="11"/>
   </w:num>
-  <w:num w:numId="13">
+  <w:num w:numId="13" w16cid:durableId="1968319841">
     <w:abstractNumId w:val="11"/>
   </w:num>
-  <w:num w:numId="14">
+  <w:num w:numId="14" w16cid:durableId="512186296">
     <w:abstractNumId w:val="11"/>
   </w:num>
-  <w:num w:numId="15">
+  <w:num w:numId="15" w16cid:durableId="421991917">
     <w:abstractNumId w:val="0"/>
   </w:num>
-  <w:num w:numId="16">
+  <w:num w:numId="16" w16cid:durableId="333145347">
     <w:abstractNumId w:val="1"/>
   </w:num>
-  <w:num w:numId="17">
+  <w:num w:numId="17" w16cid:durableId="879898065">
     <w:abstractNumId w:val="2"/>
   </w:num>
-  <w:num w:numId="18">
+  <w:num w:numId="18" w16cid:durableId="507061076">
     <w:abstractNumId w:val="3"/>
   </w:num>
-  <w:num w:numId="19">
+  <w:num w:numId="19" w16cid:durableId="1209218051">
     <w:abstractNumId w:val="8"/>
   </w:num>
-  <w:num w:numId="20">
+  <w:num w:numId="20" w16cid:durableId="208420088">
     <w:abstractNumId w:val="4"/>
   </w:num>
-  <w:num w:numId="21">
+  <w:num w:numId="21" w16cid:durableId="1371882899">
     <w:abstractNumId w:val="5"/>
   </w:num>
-  <w:num w:numId="22">
+  <w:num w:numId="22" w16cid:durableId="152839664">
     <w:abstractNumId w:val="6"/>
   </w:num>
-  <w:num w:numId="23">
+  <w:num w:numId="23" w16cid:durableId="2048286441">
     <w:abstractNumId w:val="7"/>
   </w:num>
-  <w:num w:numId="24">
+  <w:num w:numId="24" w16cid:durableId="1078213990">
     <w:abstractNumId w:val="9"/>
   </w:num>
 </w:numbering>
 </file>
 
 <file path=word/styles.xml><?xml version="1.0" encoding="utf-8"?>
-<w:styles xmlns:mc="http://schemas.openxmlformats.org/markup-compatibility/2006" xmlns:r="http://schemas.openxmlformats.org/officeDocument/2006/relationships" xmlns:w="http://schemas.openxmlformats.org/wordprocessingml/2006/main" xmlns:w14="http://schemas.microsoft.com/office/word/2010/wordml" xmlns:w15="http://schemas.microsoft.com/office/word/2012/wordml" xmlns:w16cid="http://schemas.microsoft.com/office/word/2016/wordml/cid" xmlns:w16se="http://schemas.microsoft.com/office/word/2015/wordml/symex" mc:Ignorable="w14 w15 w16se w16cid">
+<w:styles xmlns:mc="http://schemas.openxmlformats.org/markup-compatibility/2006" xmlns:r="http://schemas.openxmlformats.org/officeDocument/2006/relationships" xmlns:w="http://schemas.openxmlformats.org/wordprocessingml/2006/main" xmlns:w14="http://schemas.microsoft.com/office/word/2010/wordml" xmlns:w15="http://schemas.microsoft.com/office/word/2012/wordml" xmlns:w16cex="http://schemas.microsoft.com/office/word/2018/wordml/cex" xmlns:w16cid="http://schemas.microsoft.com/office/word/2016/wordml/cid" xmlns:w16="http://schemas.microsoft.com/office/word/2018/wordml" xmlns:w16du="http://schemas.microsoft.com/office/word/2023/wordml/word16du" xmlns:w16sdtdh="http://schemas.microsoft.com/office/word/2020/wordml/sdtdatahash" xmlns:w16sdtfl="http://schemas.microsoft.com/office/word/2024/wordml/sdtformatlock" xmlns:w16se="http://schemas.microsoft.com/office/word/2015/wordml/symex" mc:Ignorable="w14 w15 w16se w16cid w16 w16cex w16sdtdh w16sdtfl w16du">
   <w:docDefaults>
     <w:rPrDefault>
       <w:rPr>
@@ -922,7 +892,7 @@
       </w:pPr>
     </w:pPrDefault>
   </w:docDefaults>
-  <w:latentStyles w:defLockedState="0" w:defUIPriority="0" w:defSemiHidden="0" w:defUnhideWhenUsed="0" w:defQFormat="0" w:count="375">
+  <w:latentStyles w:defLockedState="0" w:defUIPriority="0" w:defSemiHidden="0" w:defUnhideWhenUsed="0" w:defQFormat="0" w:count="376">
     <w:lsdException w:name="heading 6" w:semiHidden="1" w:unhideWhenUsed="1"/>
     <w:lsdException w:name="index 3" w:semiHidden="1" w:unhideWhenUsed="1"/>
     <w:lsdException w:name="index 4" w:semiHidden="1" w:unhideWhenUsed="1"/>
@@ -1257,6 +1227,7 @@
     <w:lsdException w:name="Smart Hyperlink" w:semiHidden="1" w:uiPriority="99" w:unhideWhenUsed="1"/>
     <w:lsdException w:name="Hashtag" w:semiHidden="1" w:uiPriority="99" w:unhideWhenUsed="1"/>
     <w:lsdException w:name="Unresolved Mention" w:semiHidden="1" w:uiPriority="99" w:unhideWhenUsed="1"/>
+    <w:lsdException w:name="Smart Link" w:semiHidden="1" w:uiPriority="99" w:unhideWhenUsed="1"/>
   </w:latentStyles>
   <w:style w:type="paragraph" w:default="1" w:styleId="Standard">
     <w:name w:val="Normal"/>
@@ -1528,12 +1499,13 @@
     <w:basedOn w:val="Titel"/>
     <w:next w:val="Textkrper"/>
     <w:qFormat/>
-    <w:rsid w:val="008D03D3"/>
-    <w:pPr>
-      <w:spacing w:before="240" w:after="600"/>
-    </w:pPr>
-    <w:rPr>
-      <w:sz w:val="30"/>
+    <w:rsid w:val="00667AB3"/>
+    <w:pPr>
+      <w:spacing w:before="480" w:line="360" w:lineRule="auto"/>
+    </w:pPr>
+    <w:rPr>
+      <w:b w:val="0"/>
+      <w:sz w:val="32"/>
       <w:szCs w:val="30"/>
     </w:rPr>
   </w:style>
@@ -1558,16 +1530,15 @@
     <w:name w:val="Date"/>
     <w:next w:val="Textkrper"/>
     <w:qFormat/>
-    <w:rsid w:val="007D5C6A"/>
+    <w:rsid w:val="00667AB3"/>
     <w:pPr>
       <w:keepNext/>
       <w:keepLines/>
-      <w:spacing w:before="1000"/>
+      <w:spacing w:before="1000" w:line="360" w:lineRule="auto"/>
       <w:jc w:val="center"/>
     </w:pPr>
     <w:rPr>
       <w:rFonts w:ascii="Times New Roman" w:hAnsi="Times New Roman"/>
-      <w:sz w:val="28"/>
     </w:rPr>
   </w:style>
   <w:style w:type="paragraph" w:customStyle="1" w:styleId="Abstract">

</xml_diff>